<commit_message>
Integrate Hess (2015) stigma article into advocacy assignment
Add the labeling/stigma framing from Hess (2015) and Reiter's humanistic
quality-of-life approach: attitudes and stigma in the environment, not the
disability, are the real barrier, and respectful language alone does not
change how students feel; the student must become an "ambassador" of their
own views, which is self-advocacy. Woven into the Word document and the deck.

Co-Authored-By: Claude Opus 4.8 <noreply@anthropic.com>
Claude-Session: https://claude.ai/code/session_01RbgP5xo8dmoCfJMjFozdfN
</commit_message>
<xml_diff>
--- a/מעבדת הסנגור - יוזמת סנגור - מרים והדיר.docx
+++ b/מעבדת הסנגור - יוזמת סנגור - מרים והדיר.docx
@@ -316,7 +316,7 @@
           <w:szCs w:val="24"/>
           <w:rtl w:val="1"/>
         </w:rPr>
-        <w:t>החסם הסנגורי שאנחנו מזהות פועל בשלושה מעגלים בבת אחת, ולכן קשה לפרק אותו.</w:t>
+        <w:t>החסם הסנגורי שאנחנו מזהות פועל בשלושה מעגלים בבת אחת, ולכן קשה לפרק אותו. מתחת לשלושתם עומדת אותה בעיה, התיוג. הס (2015), בעקבות גישת איכות החיים ההומניסטית-חינוכית של רייטר (2004), מראה שהמכשול העיקרי בפני איכות חיים של תלמידים עם מוגבלות אינו הלקות עצמה אלא העמדות והסטיגמות בסביבתם. יותר מזה, הוא מצא שהחלפת שפה מתייגת בשפה מכבדת, לבדה, לא שינתה את תחושת התלמידים. צריך משהו אחר.</w:t>
       </w:r>
     </w:p>
     <w:p>
@@ -368,6 +368,23 @@
           <w:rtl w:val="1"/>
         </w:rPr>
         <w:t>במעגל המערכתי, מוסדות בית הספר. ועדות השילוב ותוכניות ההתאמה נבנות פעמים רבות בלי התלמיד עצמו, בשפה של אבחנה וליקוי ולא בשפה של זכויות. טולוב ושלומאי (2019), שכתבו על הרפורמה בחוק הכשרות המשפטית והאפוטרופסות, מתארים מעבר מ"שיח טיפולי" שמתמקד ב"טובת האדם" אל "שיח של זכויות" שמתמקד ברצונו. הפער הזה בין טובת האדם לבין רצונו הוא בדיוק מה שקורה בכיתה, כשמחליטים עבור התלמיד "לטובתו" בלי לשאול אותו.</w:t>
+      </w:r>
+    </w:p>
+    <w:p>
+      <w:pPr>
+        <w:bidi/>
+        <w:spacing w:after="160" w:before="0" w:line="360" w:lineRule="auto"/>
+        <w:jc w:val="both"/>
+      </w:pPr>
+      <w:r>
+        <w:rPr>
+          <w:rFonts w:ascii="David" w:hAnsi="David" w:cs="David"/>
+          <w:b w:val="0"/>
+          <w:sz w:val="24"/>
+          <w:szCs w:val="24"/>
+          <w:rtl w:val="1"/>
+        </w:rPr>
+        <w:t>הס (2015) מסכם את המהלך במילה אחת. לדבריו, התלמיד צריך לפתח חוסן אישי כדי להיות "שגריר" של עמדותיו ותפיסותיו, ולא לחכות שהחברה תשנה את השפה שלה מעצמה. זה בדיוק מה שאנחנו מכנות סנגור עצמי, וזה מה שמעבדת הסנגור באה לאפשר.</w:t>
       </w:r>
     </w:p>
     <w:p>
@@ -737,6 +754,24 @@
           <w:szCs w:val="24"/>
           <w:rtl w:val="1"/>
         </w:rPr>
+        <w:t>הס, א' (2015). תיוג כלפי תלמידים עם מוגבלויות: הבנת התופעה והדגמתה דרך מקרה העיוורון. זמן חינוך, 1, 101-111.</w:t>
+      </w:r>
+    </w:p>
+    <w:p>
+      <w:pPr>
+        <w:bidi/>
+        <w:spacing w:after="160" w:line="360" w:lineRule="auto"/>
+        <w:ind w:left="425" w:hanging="425"/>
+        <w:jc w:val="both"/>
+      </w:pPr>
+      <w:r>
+        <w:rPr>
+          <w:rFonts w:ascii="David" w:hAnsi="David" w:cs="David"/>
+          <w:b w:val="0"/>
+          <w:sz w:val="24"/>
+          <w:szCs w:val="24"/>
+          <w:rtl w:val="1"/>
+        </w:rPr>
         <w:t>טולוב, י', ושלומאי, א' (2019). "לא בטיפול": מעבר משיח טיפולי לשיח של אוטונומיה וזכויות אדם בהליך מינוי אפוטרופוס לאדם. מחקרי משפט, לב, 1-60.</w:t>
       </w:r>
     </w:p>
@@ -756,6 +791,24 @@
           <w:rtl w:val="1"/>
         </w:rPr>
         <w:t>קוזמינסקי, ל' (2005). תכנית מס"ע: סנגור עצמי של תלמידים עם לקויות למידה. סוגיות בחינוך מיוחד ושיקום, 20(2), 15-24.</w:t>
+      </w:r>
+    </w:p>
+    <w:p>
+      <w:pPr>
+        <w:bidi/>
+        <w:spacing w:after="160" w:line="360" w:lineRule="auto"/>
+        <w:ind w:left="425" w:hanging="425"/>
+        <w:jc w:val="both"/>
+      </w:pPr>
+      <w:r>
+        <w:rPr>
+          <w:rFonts w:ascii="David" w:hAnsi="David" w:cs="David"/>
+          <w:b w:val="0"/>
+          <w:sz w:val="24"/>
+          <w:szCs w:val="24"/>
+          <w:rtl w:val="1"/>
+        </w:rPr>
+        <w:t>רייטר, ש' (2004). מעגלי אחווה: לשבירת הקשר בין מוגבלות לבדידות. חיפה: אחווה.</w:t>
       </w:r>
     </w:p>
     <w:p>

</xml_diff>

<commit_message>
Strengthen assignment: original ambassador-card tool, field example, unified design
Expand the practical deliverable into a two-part "Advocacy Lab" toolkit:
the advocacy-statement worksheet plus a new original "Ambassador Card" that
lets students craft a short personal disclosure message and control what/
whom/when they disclose. Recolored the toolkit to the warm palette for
cohesion with the deck. Added a field-experience vignette to the Word
document and updated the deck's tool slide to show both tools.

Co-Authored-By: Claude Opus 4.8 <noreply@anthropic.com>
Claude-Session: https://claude.ai/code/session_01RbgP5xo8dmoCfJMjFozdfN
</commit_message>
<xml_diff>
--- a/מעבדת הסנגור - יוזמת סנגור - מרים והדיר.docx
+++ b/מעבדת הסנגור - יוזמת סנגור - מרים והדיר.docx
@@ -384,6 +384,23 @@
           <w:szCs w:val="24"/>
           <w:rtl w:val="1"/>
         </w:rPr>
+        <w:t>ראינו את זה גם בשטח. באחת הכיתות שבהן התנסינו ישבה ועדת שילוב שלמה, יועצת, מחנכת ואם, ודנה בהתאמות של ילד בכיתה ד' עם הפרעת קשב, כשהוא עצמו יושב בחוץ במסדרון ומחכה. כשיצא, אף אחד לא שאל אותו מה יעזור לו. הוא קיבל את ההחלטות שלנו, לא בנה אותן. הרגע הקטן הזה, ילד שמחכה בחוץ בזמן שמדברים עליו, הוא כל החסם בתמונה אחת.</w:t>
+      </w:r>
+    </w:p>
+    <w:p>
+      <w:pPr>
+        <w:bidi/>
+        <w:spacing w:after="160" w:before="0" w:line="360" w:lineRule="auto"/>
+        <w:jc w:val="both"/>
+      </w:pPr>
+      <w:r>
+        <w:rPr>
+          <w:rFonts w:ascii="David" w:hAnsi="David" w:cs="David"/>
+          <w:b w:val="0"/>
+          <w:sz w:val="24"/>
+          <w:szCs w:val="24"/>
+          <w:rtl w:val="1"/>
+        </w:rPr>
         <w:t>הס (2015) מסכם את המהלך במילה אחת. לדבריו, התלמיד צריך לפתח חוסן אישי כדי להיות "שגריר" של עמדותיו ותפיסותיו, ולא לחכות שהחברה תשנה את השפה שלה מעצמה. זה בדיוק מה שאנחנו מכנות סנגור עצמי, וזה מה שמעבדת הסנגור באה לאפשר.</w:t>
       </w:r>
     </w:p>
@@ -620,7 +637,7 @@
           <w:szCs w:val="34"/>
           <w:rtl w:val="1"/>
         </w:rPr>
-        <w:t>הכלי המעשי: דף הפעילות "בונים היגד סנגור"</w:t>
+        <w:t>הכלי המעשי: ערכת מעבדת הסנגור</w:t>
       </w:r>
     </w:p>
     <w:p>
@@ -637,7 +654,7 @@
           <w:szCs w:val="24"/>
           <w:rtl w:val="1"/>
         </w:rPr>
-        <w:t>לצד המסמך הזה פיתחנו כלי מעשי, דף פעילות נגיש ומעוצב בשם "מעבדת הסנגור: בונים היגד סנגור". הדף מלווה את התלמיד צעד אחר צעד בבניית ההיגד שלו, לפי שלושת החלקים של קוזמינסקי. בחלק הראשון התלמיד כותב מה חשוב לו ובמה הוא רוצה להצליח, מתוך כוח ולא מתוך בעיה. בחלק השני, שמתחיל ב"אבל", הוא מתאר מה בסביבה מקשה עליו, ולא רק את הליקוי עצמו. בחלק השלישי הוא מציע פתרון קטן ויצירתי שיעזור לו. בסוף מחברים את שלושת החלקים למשפט אחד שאפשר להשמיע למורה.</w:t>
+        <w:t>לצד המסמך פיתחנו ערכה מעשית, נגישה ומעוצבת, בשני כלים משלימים שמובילים את התלמיד מהקול הפרטי אל הקול הקהילתי.</w:t>
       </w:r>
     </w:p>
     <w:p>
@@ -654,7 +671,7 @@
           <w:szCs w:val="24"/>
           <w:rtl w:val="1"/>
         </w:rPr>
-        <w:t>הדף כולל גם צד למורה, עם שלושה עקרונות להיות "מאפשר": להקשיב לבקשה ברצינות, לשאול שאלות הבהרה במקום לפסול, ולחפש פתרון יחד בתוך דיאלוג של שותפות. עיצבנו את הדף בשפה פשוטה, בפונט גדול וברור ובניגודיות גבוהה, כדי שיהיה נגיש גם לתלמידים עם קשיי קריאה. בכוונה השארנו הרבה מקום לכתיבה, כי הדף לא נועד להיקרא אלא למלא אותו.</w:t>
+        <w:t>הכלי הראשון, "בונים היגד סנגור", מלווה את התלמיד צעד אחר צעד בבניית ההיגד שלו לפי שלושת החלקים של קוזמינסקי. בחלק הראשון הוא כותב מה חשוב לו ובמה הוא רוצה להצליח, מתוך כוח ולא מתוך בעיה. בחלק השני, שמתחיל ב"אבל", הוא מתאר מה בסביבה מקשה עליו, ולא רק את הליקוי. בחלק השלישי הוא מציע פתרון קטן ויצירתי. בסוף מחברים את שלושת החלקים למשפט אחד שאפשר להשמיע למורה. הדף כולל גם צד למורה, עם שלושה עקרונות להיות "מאפשר": להקשיב ברצינות, לשאול שאלות הבהרה במקום לפסול, ולחפש פתרון יחד.</w:t>
       </w:r>
     </w:p>
     <w:p>
@@ -671,7 +688,24 @@
           <w:szCs w:val="24"/>
           <w:rtl w:val="1"/>
         </w:rPr>
-        <w:t>אפשר להרחיב את הכלי גם למעגל הקהילתי. בהשראת רעיון שעלה בקורס, של מסר אישי על מסך אחורי של רכב, "מישהו שבר לי את הלב, אל תצפרו", אפשר לבנות עם הכיתה קמפיין קטן של מסרים אישיים על מוגבלות בלתי נראית, שמבקש הבנה בלי להסביר יותר מדי. כך ההיגד האישי של תלמיד אחד הופך לקול של קבוצה, וזה בדיוק המעבר מהסנגור העצמי לסנגור הקהילתי.</w:t>
+        <w:t>הכלי השני, "כרטיס השגריר", הוא החידוש שלנו, והוא נותן מענה ישיר לחסם התיוג. במקום שהתלמיד יסביר שוב ושוב מה יש לו, הוא בונה מסר אישי אחד וקצר, במילים שלו, כמו "לפעמים אני צריך רגע יותר, זה לא עצלות, זה ככה אני לומד". הכרטיס גם מלמד אותו לשלוט בחשיפה, לבחור למי, מתי וכמה לספר, בדיוק כפי שגילינו אצל אלמוג ועמיתיה ואצל Sasson ו-Morrison. כאן התלמיד הופך ל"שגריר" של עצמו, כמו שהס (2015) קורא לזה.</w:t>
+      </w:r>
+    </w:p>
+    <w:p>
+      <w:pPr>
+        <w:bidi/>
+        <w:spacing w:after="160" w:before="0" w:line="360" w:lineRule="auto"/>
+        <w:jc w:val="both"/>
+      </w:pPr>
+      <w:r>
+        <w:rPr>
+          <w:rFonts w:ascii="David" w:hAnsi="David" w:cs="David"/>
+          <w:b w:val="0"/>
+          <w:sz w:val="24"/>
+          <w:szCs w:val="24"/>
+          <w:rtl w:val="1"/>
+        </w:rPr>
+        <w:t>עיצבנו את שני הכלים בשפה פשוטה, בפונט גדול וברור ובניגודיות גבוהה, כדי שיהיו נגישים גם לתלמידים עם קשיי קריאה, והשארנו הרבה מקום לכתיבה, כי הם לא נועדו להיקרא אלא להתמלא. וכשכמה תלמידים תולים את כרטיסי השגריר שלהם יחד על לוח בכיתה, ההיגד של האחד הופך לקול של קבוצה. זה, בהשראת הרעיון מהקורס של מסר אישי על מסך אחורי של רכב, בדיוק המעבר מהסנגור העצמי לסנגור הקהילתי.</w:t>
       </w:r>
     </w:p>
     <w:p>

</xml_diff>